<commit_message>
Update  Phase 2 document formatting
</commit_message>
<xml_diff>
--- a/Phase 2 - Requirement Analysis/Phase 2 - Requirement Analysis.docx
+++ b/Phase 2 - Requirement Analysis/Phase 2 - Requirement Analysis.docx
@@ -6,14 +6,20 @@
       <w:pPr>
         <w:jc w:val="center"/>
         <w:rPr>
+          <w:rFonts w:ascii="Times New Roman" w:hAnsi="Times New Roman" w:cs="Times New Roman"/>
           <w:b/>
           <w:bCs/>
-        </w:rPr>
-      </w:pPr>
-      <w:r>
-        <w:rPr>
+          <w:sz w:val="32"/>
+          <w:szCs w:val="32"/>
+        </w:rPr>
+      </w:pPr>
+      <w:r>
+        <w:rPr>
+          <w:rFonts w:ascii="Times New Roman" w:hAnsi="Times New Roman" w:cs="Times New Roman"/>
           <w:b/>
           <w:bCs/>
+          <w:sz w:val="32"/>
+          <w:szCs w:val="32"/>
         </w:rPr>
         <w:t>Phase 2 – Requirement Analysis</w:t>
       </w:r>
@@ -21,11 +27,19 @@
     <w:p>
       <w:pPr>
         <w:jc w:val="center"/>
-      </w:pPr>
-      <w:r>
-        <w:rPr>
+        <w:rPr>
+          <w:rFonts w:ascii="Times New Roman" w:hAnsi="Times New Roman" w:cs="Times New Roman"/>
+          <w:sz w:val="32"/>
+          <w:szCs w:val="32"/>
+        </w:rPr>
+      </w:pPr>
+      <w:r>
+        <w:rPr>
+          <w:rFonts w:ascii="Times New Roman" w:hAnsi="Times New Roman" w:cs="Times New Roman"/>
           <w:b/>
           <w:bCs/>
+          <w:sz w:val="32"/>
+          <w:szCs w:val="32"/>
         </w:rPr>
         <w:t>Script-Controlled ACL – Restrict Record Access Based on Field Value</w:t>
       </w:r>
@@ -33,20 +47,34 @@
     <w:p>
       <w:pPr>
         <w:rPr>
+          <w:rFonts w:ascii="Times New Roman" w:hAnsi="Times New Roman" w:cs="Times New Roman"/>
           <w:b/>
           <w:bCs/>
-        </w:rPr>
-      </w:pPr>
-      <w:r>
-        <w:rPr>
+          <w:sz w:val="28"/>
+          <w:szCs w:val="28"/>
+        </w:rPr>
+      </w:pPr>
+      <w:r>
+        <w:rPr>
+          <w:rFonts w:ascii="Times New Roman" w:hAnsi="Times New Roman" w:cs="Times New Roman"/>
           <w:b/>
           <w:bCs/>
+          <w:sz w:val="28"/>
+          <w:szCs w:val="28"/>
         </w:rPr>
         <w:t>1. Functional Requirements</w:t>
       </w:r>
     </w:p>
     <w:p>
-      <w:r>
+      <w:pPr>
+        <w:rPr>
+          <w:rFonts w:ascii="Times New Roman" w:hAnsi="Times New Roman" w:cs="Times New Roman"/>
+        </w:rPr>
+      </w:pPr>
+      <w:r>
+        <w:rPr>
+          <w:rFonts w:ascii="Times New Roman" w:hAnsi="Times New Roman" w:cs="Times New Roman"/>
+        </w:rPr>
         <w:t>The project requires the following functionalities:</w:t>
       </w:r>
     </w:p>
@@ -56,18 +84,28 @@
           <w:ilvl w:val="0"/>
           <w:numId w:val="1"/>
         </w:numPr>
-      </w:pPr>
-      <w:r>
+        <w:rPr>
+          <w:rFonts w:ascii="Times New Roman" w:hAnsi="Times New Roman" w:cs="Times New Roman"/>
+        </w:rPr>
+      </w:pPr>
+      <w:r>
+        <w:rPr>
+          <w:rFonts w:ascii="Times New Roman" w:hAnsi="Times New Roman" w:cs="Times New Roman"/>
+        </w:rPr>
         <w:t xml:space="preserve">Create a test user named </w:t>
       </w:r>
       <w:r>
         <w:rPr>
+          <w:rFonts w:ascii="Times New Roman" w:hAnsi="Times New Roman" w:cs="Times New Roman"/>
           <w:b/>
           <w:bCs/>
         </w:rPr>
         <w:t>EEE User</w:t>
       </w:r>
       <w:r>
+        <w:rPr>
+          <w:rFonts w:ascii="Times New Roman" w:hAnsi="Times New Roman" w:cs="Times New Roman"/>
+        </w:rPr>
         <w:t>.</w:t>
       </w:r>
     </w:p>
@@ -77,8 +115,14 @@
           <w:ilvl w:val="0"/>
           <w:numId w:val="1"/>
         </w:numPr>
-      </w:pPr>
-      <w:r>
+        <w:rPr>
+          <w:rFonts w:ascii="Times New Roman" w:hAnsi="Times New Roman" w:cs="Times New Roman"/>
+        </w:rPr>
+      </w:pPr>
+      <w:r>
+        <w:rPr>
+          <w:rFonts w:ascii="Times New Roman" w:hAnsi="Times New Roman" w:cs="Times New Roman"/>
+        </w:rPr>
         <w:t>Create four custom roles:</w:t>
       </w:r>
     </w:p>
@@ -88,8 +132,14 @@
           <w:ilvl w:val="1"/>
           <w:numId w:val="1"/>
         </w:numPr>
-      </w:pPr>
-      <w:r>
+        <w:rPr>
+          <w:rFonts w:ascii="Times New Roman" w:hAnsi="Times New Roman" w:cs="Times New Roman"/>
+        </w:rPr>
+      </w:pPr>
+      <w:r>
+        <w:rPr>
+          <w:rFonts w:ascii="Times New Roman" w:hAnsi="Times New Roman" w:cs="Times New Roman"/>
+        </w:rPr>
         <w:t>bb1</w:t>
       </w:r>
     </w:p>
@@ -99,8 +149,14 @@
           <w:ilvl w:val="1"/>
           <w:numId w:val="1"/>
         </w:numPr>
-      </w:pPr>
-      <w:r>
+        <w:rPr>
+          <w:rFonts w:ascii="Times New Roman" w:hAnsi="Times New Roman" w:cs="Times New Roman"/>
+        </w:rPr>
+      </w:pPr>
+      <w:r>
+        <w:rPr>
+          <w:rFonts w:ascii="Times New Roman" w:hAnsi="Times New Roman" w:cs="Times New Roman"/>
+        </w:rPr>
         <w:t>bb2</w:t>
       </w:r>
     </w:p>
@@ -110,8 +166,14 @@
           <w:ilvl w:val="1"/>
           <w:numId w:val="1"/>
         </w:numPr>
-      </w:pPr>
-      <w:r>
+        <w:rPr>
+          <w:rFonts w:ascii="Times New Roman" w:hAnsi="Times New Roman" w:cs="Times New Roman"/>
+        </w:rPr>
+      </w:pPr>
+      <w:r>
+        <w:rPr>
+          <w:rFonts w:ascii="Times New Roman" w:hAnsi="Times New Roman" w:cs="Times New Roman"/>
+        </w:rPr>
         <w:t>bb3</w:t>
       </w:r>
     </w:p>
@@ -121,8 +183,14 @@
           <w:ilvl w:val="1"/>
           <w:numId w:val="1"/>
         </w:numPr>
-      </w:pPr>
-      <w:r>
+        <w:rPr>
+          <w:rFonts w:ascii="Times New Roman" w:hAnsi="Times New Roman" w:cs="Times New Roman"/>
+        </w:rPr>
+      </w:pPr>
+      <w:r>
+        <w:rPr>
+          <w:rFonts w:ascii="Times New Roman" w:hAnsi="Times New Roman" w:cs="Times New Roman"/>
+        </w:rPr>
         <w:t>bb4</w:t>
       </w:r>
     </w:p>
@@ -132,8 +200,14 @@
           <w:ilvl w:val="0"/>
           <w:numId w:val="1"/>
         </w:numPr>
-      </w:pPr>
-      <w:r>
+        <w:rPr>
+          <w:rFonts w:ascii="Times New Roman" w:hAnsi="Times New Roman" w:cs="Times New Roman"/>
+        </w:rPr>
+      </w:pPr>
+      <w:r>
+        <w:rPr>
+          <w:rFonts w:ascii="Times New Roman" w:hAnsi="Times New Roman" w:cs="Times New Roman"/>
+        </w:rPr>
         <w:t>Assign the roles to the EEE User.</w:t>
       </w:r>
     </w:p>
@@ -143,18 +217,28 @@
           <w:ilvl w:val="0"/>
           <w:numId w:val="1"/>
         </w:numPr>
-      </w:pPr>
-      <w:r>
+        <w:rPr>
+          <w:rFonts w:ascii="Times New Roman" w:hAnsi="Times New Roman" w:cs="Times New Roman"/>
+        </w:rPr>
+      </w:pPr>
+      <w:r>
+        <w:rPr>
+          <w:rFonts w:ascii="Times New Roman" w:hAnsi="Times New Roman" w:cs="Times New Roman"/>
+        </w:rPr>
         <w:t xml:space="preserve">Create a custom table named </w:t>
       </w:r>
       <w:r>
         <w:rPr>
+          <w:rFonts w:ascii="Times New Roman" w:hAnsi="Times New Roman" w:cs="Times New Roman"/>
           <w:b/>
           <w:bCs/>
         </w:rPr>
         <w:t>Institution Details</w:t>
       </w:r>
       <w:r>
+        <w:rPr>
+          <w:rFonts w:ascii="Times New Roman" w:hAnsi="Times New Roman" w:cs="Times New Roman"/>
+        </w:rPr>
         <w:t>.</w:t>
       </w:r>
     </w:p>
@@ -164,8 +248,14 @@
           <w:ilvl w:val="0"/>
           <w:numId w:val="1"/>
         </w:numPr>
-      </w:pPr>
-      <w:r>
+        <w:rPr>
+          <w:rFonts w:ascii="Times New Roman" w:hAnsi="Times New Roman" w:cs="Times New Roman"/>
+        </w:rPr>
+      </w:pPr>
+      <w:r>
+        <w:rPr>
+          <w:rFonts w:ascii="Times New Roman" w:hAnsi="Times New Roman" w:cs="Times New Roman"/>
+        </w:rPr>
         <w:t>Add the required fields to the table.</w:t>
       </w:r>
     </w:p>
@@ -175,8 +265,14 @@
           <w:ilvl w:val="0"/>
           <w:numId w:val="1"/>
         </w:numPr>
-      </w:pPr>
-      <w:r>
+        <w:rPr>
+          <w:rFonts w:ascii="Times New Roman" w:hAnsi="Times New Roman" w:cs="Times New Roman"/>
+        </w:rPr>
+      </w:pPr>
+      <w:r>
+        <w:rPr>
+          <w:rFonts w:ascii="Times New Roman" w:hAnsi="Times New Roman" w:cs="Times New Roman"/>
+        </w:rPr>
         <w:t>Create multiple records with different branch values.</w:t>
       </w:r>
     </w:p>
@@ -186,8 +282,14 @@
           <w:ilvl w:val="0"/>
           <w:numId w:val="1"/>
         </w:numPr>
-      </w:pPr>
-      <w:r>
+        <w:rPr>
+          <w:rFonts w:ascii="Times New Roman" w:hAnsi="Times New Roman" w:cs="Times New Roman"/>
+        </w:rPr>
+      </w:pPr>
+      <w:r>
+        <w:rPr>
+          <w:rFonts w:ascii="Times New Roman" w:hAnsi="Times New Roman" w:cs="Times New Roman"/>
+        </w:rPr>
         <w:t>Create READ, CREATE, WRITE and DELETE ACLs.</w:t>
       </w:r>
     </w:p>
@@ -197,80 +299,123 @@
           <w:ilvl w:val="0"/>
           <w:numId w:val="1"/>
         </w:numPr>
-      </w:pPr>
-      <w:r>
+        <w:rPr>
+          <w:rFonts w:ascii="Times New Roman" w:hAnsi="Times New Roman" w:cs="Times New Roman"/>
+        </w:rPr>
+      </w:pPr>
+      <w:r>
+        <w:rPr>
+          <w:rFonts w:ascii="Times New Roman" w:hAnsi="Times New Roman" w:cs="Times New Roman"/>
+        </w:rPr>
         <w:t>Test the ACL behaviour using user impersonation.</w:t>
       </w:r>
     </w:p>
     <w:p>
       <w:pPr>
         <w:rPr>
+          <w:rFonts w:ascii="Times New Roman" w:hAnsi="Times New Roman" w:cs="Times New Roman"/>
           <w:b/>
           <w:bCs/>
-        </w:rPr>
-      </w:pPr>
-      <w:r>
-        <w:rPr>
+          <w:sz w:val="28"/>
+          <w:szCs w:val="28"/>
+        </w:rPr>
+      </w:pPr>
+      <w:r>
+        <w:rPr>
+          <w:rFonts w:ascii="Times New Roman" w:hAnsi="Times New Roman" w:cs="Times New Roman"/>
           <w:b/>
           <w:bCs/>
+          <w:sz w:val="28"/>
+          <w:szCs w:val="28"/>
         </w:rPr>
         <w:t>2. User Requirements</w:t>
       </w:r>
     </w:p>
     <w:p>
-      <w:r>
-        <w:rPr>
+      <w:pPr>
+        <w:rPr>
+          <w:rFonts w:ascii="Times New Roman" w:hAnsi="Times New Roman" w:cs="Times New Roman"/>
+        </w:rPr>
+      </w:pPr>
+      <w:r>
+        <w:rPr>
+          <w:rFonts w:ascii="Times New Roman" w:hAnsi="Times New Roman" w:cs="Times New Roman"/>
           <w:b/>
           <w:bCs/>
         </w:rPr>
         <w:t>User ID:</w:t>
       </w:r>
       <w:r>
+        <w:rPr>
+          <w:rFonts w:ascii="Times New Roman" w:hAnsi="Times New Roman" w:cs="Times New Roman"/>
+        </w:rPr>
         <w:t xml:space="preserve"> EEE User</w:t>
       </w:r>
       <w:r>
+        <w:rPr>
+          <w:rFonts w:ascii="Times New Roman" w:hAnsi="Times New Roman" w:cs="Times New Roman"/>
+        </w:rPr>
         <w:br/>
       </w:r>
       <w:r>
         <w:rPr>
+          <w:rFonts w:ascii="Times New Roman" w:hAnsi="Times New Roman" w:cs="Times New Roman"/>
           <w:b/>
           <w:bCs/>
         </w:rPr>
         <w:t>First Name:</w:t>
       </w:r>
       <w:r>
+        <w:rPr>
+          <w:rFonts w:ascii="Times New Roman" w:hAnsi="Times New Roman" w:cs="Times New Roman"/>
+        </w:rPr>
         <w:t xml:space="preserve"> EEE</w:t>
       </w:r>
       <w:r>
+        <w:rPr>
+          <w:rFonts w:ascii="Times New Roman" w:hAnsi="Times New Roman" w:cs="Times New Roman"/>
+        </w:rPr>
         <w:br/>
       </w:r>
       <w:r>
         <w:rPr>
+          <w:rFonts w:ascii="Times New Roman" w:hAnsi="Times New Roman" w:cs="Times New Roman"/>
           <w:b/>
           <w:bCs/>
         </w:rPr>
         <w:t>Last Name:</w:t>
       </w:r>
       <w:r>
+        <w:rPr>
+          <w:rFonts w:ascii="Times New Roman" w:hAnsi="Times New Roman" w:cs="Times New Roman"/>
+        </w:rPr>
         <w:t xml:space="preserve"> User</w:t>
       </w:r>
       <w:r>
+        <w:rPr>
+          <w:rFonts w:ascii="Times New Roman" w:hAnsi="Times New Roman" w:cs="Times New Roman"/>
+        </w:rPr>
         <w:br/>
       </w:r>
       <w:r>
         <w:rPr>
+          <w:rFonts w:ascii="Times New Roman" w:hAnsi="Times New Roman" w:cs="Times New Roman"/>
           <w:b/>
           <w:bCs/>
         </w:rPr>
         <w:t>Email:</w:t>
       </w:r>
       <w:r>
+        <w:rPr>
+          <w:rFonts w:ascii="Times New Roman" w:hAnsi="Times New Roman" w:cs="Times New Roman"/>
+        </w:rPr>
         <w:t xml:space="preserve"> </w:t>
       </w:r>
       <w:hyperlink r:id="rId5" w:history="1">
         <w:r>
           <w:rPr>
             <w:rStyle w:val="Hyperlink"/>
+            <w:rFonts w:ascii="Times New Roman" w:hAnsi="Times New Roman" w:cs="Times New Roman"/>
           </w:rPr>
           <w:t>eeeuser@gmail.com</w:t>
         </w:r>
@@ -279,20 +424,34 @@
     <w:p>
       <w:pPr>
         <w:rPr>
+          <w:rFonts w:ascii="Times New Roman" w:hAnsi="Times New Roman" w:cs="Times New Roman"/>
           <w:b/>
           <w:bCs/>
-        </w:rPr>
-      </w:pPr>
-      <w:r>
-        <w:rPr>
+          <w:sz w:val="28"/>
+          <w:szCs w:val="28"/>
+        </w:rPr>
+      </w:pPr>
+      <w:r>
+        <w:rPr>
+          <w:rFonts w:ascii="Times New Roman" w:hAnsi="Times New Roman" w:cs="Times New Roman"/>
           <w:b/>
           <w:bCs/>
+          <w:sz w:val="28"/>
+          <w:szCs w:val="28"/>
         </w:rPr>
         <w:t>3. Role Requirements</w:t>
       </w:r>
     </w:p>
     <w:p>
-      <w:r>
+      <w:pPr>
+        <w:rPr>
+          <w:rFonts w:ascii="Times New Roman" w:hAnsi="Times New Roman" w:cs="Times New Roman"/>
+        </w:rPr>
+      </w:pPr>
+      <w:r>
+        <w:rPr>
+          <w:rFonts w:ascii="Times New Roman" w:hAnsi="Times New Roman" w:cs="Times New Roman"/>
+        </w:rPr>
         <w:t>The following custom roles are required:</w:t>
       </w:r>
     </w:p>
@@ -302,8 +461,14 @@
           <w:ilvl w:val="0"/>
           <w:numId w:val="2"/>
         </w:numPr>
-      </w:pPr>
-      <w:r>
+        <w:rPr>
+          <w:rFonts w:ascii="Times New Roman" w:hAnsi="Times New Roman" w:cs="Times New Roman"/>
+        </w:rPr>
+      </w:pPr>
+      <w:r>
+        <w:rPr>
+          <w:rFonts w:ascii="Times New Roman" w:hAnsi="Times New Roman" w:cs="Times New Roman"/>
+        </w:rPr>
         <w:t>bb1</w:t>
       </w:r>
     </w:p>
@@ -313,8 +478,14 @@
           <w:ilvl w:val="0"/>
           <w:numId w:val="2"/>
         </w:numPr>
-      </w:pPr>
-      <w:r>
+        <w:rPr>
+          <w:rFonts w:ascii="Times New Roman" w:hAnsi="Times New Roman" w:cs="Times New Roman"/>
+        </w:rPr>
+      </w:pPr>
+      <w:r>
+        <w:rPr>
+          <w:rFonts w:ascii="Times New Roman" w:hAnsi="Times New Roman" w:cs="Times New Roman"/>
+        </w:rPr>
         <w:t>bb2</w:t>
       </w:r>
     </w:p>
@@ -324,8 +495,14 @@
           <w:ilvl w:val="0"/>
           <w:numId w:val="2"/>
         </w:numPr>
-      </w:pPr>
-      <w:r>
+        <w:rPr>
+          <w:rFonts w:ascii="Times New Roman" w:hAnsi="Times New Roman" w:cs="Times New Roman"/>
+        </w:rPr>
+      </w:pPr>
+      <w:r>
+        <w:rPr>
+          <w:rFonts w:ascii="Times New Roman" w:hAnsi="Times New Roman" w:cs="Times New Roman"/>
+        </w:rPr>
         <w:t>bb3</w:t>
       </w:r>
     </w:p>
@@ -335,93 +512,158 @@
           <w:ilvl w:val="0"/>
           <w:numId w:val="2"/>
         </w:numPr>
-      </w:pPr>
-      <w:r>
+        <w:rPr>
+          <w:rFonts w:ascii="Times New Roman" w:hAnsi="Times New Roman" w:cs="Times New Roman"/>
+        </w:rPr>
+      </w:pPr>
+      <w:r>
+        <w:rPr>
+          <w:rFonts w:ascii="Times New Roman" w:hAnsi="Times New Roman" w:cs="Times New Roman"/>
+        </w:rPr>
         <w:t>bb4</w:t>
       </w:r>
     </w:p>
     <w:p>
-      <w:r>
+      <w:pPr>
+        <w:rPr>
+          <w:rFonts w:ascii="Times New Roman" w:hAnsi="Times New Roman" w:cs="Times New Roman"/>
+        </w:rPr>
+      </w:pPr>
+      <w:r>
+        <w:rPr>
+          <w:rFonts w:ascii="Times New Roman" w:hAnsi="Times New Roman" w:cs="Times New Roman"/>
+        </w:rPr>
         <w:t>All four roles are assigned to the EEE User.</w:t>
       </w:r>
     </w:p>
-    <w:p/>
-    <w:p>
-      <w:pPr>
-        <w:rPr>
+    <w:p>
+      <w:pPr>
+        <w:rPr>
+          <w:rFonts w:ascii="Times New Roman" w:hAnsi="Times New Roman" w:cs="Times New Roman"/>
+        </w:rPr>
+      </w:pPr>
+    </w:p>
+    <w:p>
+      <w:pPr>
+        <w:rPr>
+          <w:rFonts w:ascii="Times New Roman" w:hAnsi="Times New Roman" w:cs="Times New Roman"/>
           <w:b/>
           <w:bCs/>
-        </w:rPr>
-      </w:pPr>
-      <w:r>
-        <w:rPr>
+          <w:sz w:val="28"/>
+          <w:szCs w:val="28"/>
+        </w:rPr>
+      </w:pPr>
+      <w:r>
+        <w:rPr>
+          <w:rFonts w:ascii="Times New Roman" w:hAnsi="Times New Roman" w:cs="Times New Roman"/>
           <w:b/>
           <w:bCs/>
-        </w:rPr>
-        <w:lastRenderedPageBreak/>
+          <w:sz w:val="28"/>
+          <w:szCs w:val="28"/>
+        </w:rPr>
         <w:t>4. Table Requirements</w:t>
       </w:r>
     </w:p>
     <w:p>
-      <w:r>
-        <w:rPr>
+      <w:pPr>
+        <w:rPr>
+          <w:rFonts w:ascii="Times New Roman" w:hAnsi="Times New Roman" w:cs="Times New Roman"/>
+        </w:rPr>
+      </w:pPr>
+      <w:r>
+        <w:rPr>
+          <w:rFonts w:ascii="Times New Roman" w:hAnsi="Times New Roman" w:cs="Times New Roman"/>
           <w:b/>
           <w:bCs/>
         </w:rPr>
         <w:t>Label:</w:t>
       </w:r>
       <w:r>
+        <w:rPr>
+          <w:rFonts w:ascii="Times New Roman" w:hAnsi="Times New Roman" w:cs="Times New Roman"/>
+        </w:rPr>
         <w:t xml:space="preserve"> Institution Details</w:t>
       </w:r>
       <w:r>
+        <w:rPr>
+          <w:rFonts w:ascii="Times New Roman" w:hAnsi="Times New Roman" w:cs="Times New Roman"/>
+        </w:rPr>
         <w:br/>
       </w:r>
       <w:r>
         <w:rPr>
+          <w:rFonts w:ascii="Times New Roman" w:hAnsi="Times New Roman" w:cs="Times New Roman"/>
           <w:b/>
           <w:bCs/>
         </w:rPr>
         <w:t>Name:</w:t>
       </w:r>
       <w:r>
+        <w:rPr>
+          <w:rFonts w:ascii="Times New Roman" w:hAnsi="Times New Roman" w:cs="Times New Roman"/>
+        </w:rPr>
         <w:t xml:space="preserve"> </w:t>
       </w:r>
       <w:proofErr w:type="spellStart"/>
       <w:r>
+        <w:rPr>
+          <w:rFonts w:ascii="Times New Roman" w:hAnsi="Times New Roman" w:cs="Times New Roman"/>
+        </w:rPr>
         <w:t>u_institution_details</w:t>
       </w:r>
       <w:proofErr w:type="spellEnd"/>
       <w:r>
+        <w:rPr>
+          <w:rFonts w:ascii="Times New Roman" w:hAnsi="Times New Roman" w:cs="Times New Roman"/>
+        </w:rPr>
         <w:br/>
       </w:r>
       <w:r>
         <w:rPr>
+          <w:rFonts w:ascii="Times New Roman" w:hAnsi="Times New Roman" w:cs="Times New Roman"/>
           <w:b/>
           <w:bCs/>
         </w:rPr>
         <w:t>Extends for:</w:t>
       </w:r>
       <w:r>
+        <w:rPr>
+          <w:rFonts w:ascii="Times New Roman" w:hAnsi="Times New Roman" w:cs="Times New Roman"/>
+        </w:rPr>
         <w:t xml:space="preserve"> false</w:t>
       </w:r>
     </w:p>
     <w:p>
       <w:pPr>
         <w:rPr>
+          <w:rFonts w:ascii="Times New Roman" w:hAnsi="Times New Roman" w:cs="Times New Roman"/>
           <w:b/>
           <w:bCs/>
-        </w:rPr>
-      </w:pPr>
-      <w:r>
-        <w:rPr>
+          <w:sz w:val="28"/>
+          <w:szCs w:val="28"/>
+        </w:rPr>
+      </w:pPr>
+      <w:r>
+        <w:rPr>
+          <w:rFonts w:ascii="Times New Roman" w:hAnsi="Times New Roman" w:cs="Times New Roman"/>
           <w:b/>
           <w:bCs/>
+          <w:sz w:val="28"/>
+          <w:szCs w:val="28"/>
         </w:rPr>
         <w:t>5. Field Requirements</w:t>
       </w:r>
     </w:p>
     <w:p>
-      <w:r>
+      <w:pPr>
+        <w:rPr>
+          <w:rFonts w:ascii="Times New Roman" w:hAnsi="Times New Roman" w:cs="Times New Roman"/>
+        </w:rPr>
+      </w:pPr>
+      <w:r>
+        <w:rPr>
+          <w:rFonts w:ascii="Times New Roman" w:hAnsi="Times New Roman" w:cs="Times New Roman"/>
+        </w:rPr>
         <w:t>The table contains the following fields:</w:t>
       </w:r>
     </w:p>
@@ -438,8 +680,8 @@
         <w:tblLook w:val="04A0" w:firstRow="1" w:lastRow="0" w:firstColumn="1" w:lastColumn="0" w:noHBand="0" w:noVBand="1"/>
       </w:tblPr>
       <w:tblGrid>
-        <w:gridCol w:w="2242"/>
-        <w:gridCol w:w="1796"/>
+        <w:gridCol w:w="2129"/>
+        <w:gridCol w:w="1701"/>
       </w:tblGrid>
       <w:tr>
         <w:trPr>
@@ -455,12 +697,14 @@
           <w:p>
             <w:pPr>
               <w:rPr>
+                <w:rFonts w:ascii="Times New Roman" w:hAnsi="Times New Roman" w:cs="Times New Roman"/>
                 <w:b/>
                 <w:bCs/>
               </w:rPr>
             </w:pPr>
             <w:r>
               <w:rPr>
+                <w:rFonts w:ascii="Times New Roman" w:hAnsi="Times New Roman" w:cs="Times New Roman"/>
                 <w:b/>
                 <w:bCs/>
               </w:rPr>
@@ -477,12 +721,14 @@
           <w:p>
             <w:pPr>
               <w:rPr>
+                <w:rFonts w:ascii="Times New Roman" w:hAnsi="Times New Roman" w:cs="Times New Roman"/>
                 <w:b/>
                 <w:bCs/>
               </w:rPr>
             </w:pPr>
             <w:r>
               <w:rPr>
+                <w:rFonts w:ascii="Times New Roman" w:hAnsi="Times New Roman" w:cs="Times New Roman"/>
                 <w:b/>
                 <w:bCs/>
               </w:rPr>
@@ -502,7 +748,15 @@
             <w:hideMark/>
           </w:tcPr>
           <w:p>
+            <w:pPr>
+              <w:rPr>
+                <w:rFonts w:ascii="Times New Roman" w:hAnsi="Times New Roman" w:cs="Times New Roman"/>
+              </w:rPr>
+            </w:pPr>
             <w:r>
+              <w:rPr>
+                <w:rFonts w:ascii="Times New Roman" w:hAnsi="Times New Roman" w:cs="Times New Roman"/>
+              </w:rPr>
               <w:t>Student Roll Number</w:t>
             </w:r>
           </w:p>
@@ -514,7 +768,15 @@
             <w:hideMark/>
           </w:tcPr>
           <w:p>
+            <w:pPr>
+              <w:rPr>
+                <w:rFonts w:ascii="Times New Roman" w:hAnsi="Times New Roman" w:cs="Times New Roman"/>
+              </w:rPr>
+            </w:pPr>
             <w:r>
+              <w:rPr>
+                <w:rFonts w:ascii="Times New Roman" w:hAnsi="Times New Roman" w:cs="Times New Roman"/>
+              </w:rPr>
               <w:t>Auto Number</w:t>
             </w:r>
           </w:p>
@@ -531,7 +793,15 @@
             <w:hideMark/>
           </w:tcPr>
           <w:p>
+            <w:pPr>
+              <w:rPr>
+                <w:rFonts w:ascii="Times New Roman" w:hAnsi="Times New Roman" w:cs="Times New Roman"/>
+              </w:rPr>
+            </w:pPr>
             <w:r>
+              <w:rPr>
+                <w:rFonts w:ascii="Times New Roman" w:hAnsi="Times New Roman" w:cs="Times New Roman"/>
+              </w:rPr>
               <w:t>Student Name</w:t>
             </w:r>
           </w:p>
@@ -543,7 +813,15 @@
             <w:hideMark/>
           </w:tcPr>
           <w:p>
+            <w:pPr>
+              <w:rPr>
+                <w:rFonts w:ascii="Times New Roman" w:hAnsi="Times New Roman" w:cs="Times New Roman"/>
+              </w:rPr>
+            </w:pPr>
             <w:r>
+              <w:rPr>
+                <w:rFonts w:ascii="Times New Roman" w:hAnsi="Times New Roman" w:cs="Times New Roman"/>
+              </w:rPr>
               <w:t>Reference - User</w:t>
             </w:r>
           </w:p>
@@ -560,7 +838,15 @@
             <w:hideMark/>
           </w:tcPr>
           <w:p>
+            <w:pPr>
+              <w:rPr>
+                <w:rFonts w:ascii="Times New Roman" w:hAnsi="Times New Roman" w:cs="Times New Roman"/>
+              </w:rPr>
+            </w:pPr>
             <w:r>
+              <w:rPr>
+                <w:rFonts w:ascii="Times New Roman" w:hAnsi="Times New Roman" w:cs="Times New Roman"/>
+              </w:rPr>
               <w:t>Faculty Name</w:t>
             </w:r>
           </w:p>
@@ -572,7 +858,15 @@
             <w:hideMark/>
           </w:tcPr>
           <w:p>
+            <w:pPr>
+              <w:rPr>
+                <w:rFonts w:ascii="Times New Roman" w:hAnsi="Times New Roman" w:cs="Times New Roman"/>
+              </w:rPr>
+            </w:pPr>
             <w:r>
+              <w:rPr>
+                <w:rFonts w:ascii="Times New Roman" w:hAnsi="Times New Roman" w:cs="Times New Roman"/>
+              </w:rPr>
               <w:t>Reference - User</w:t>
             </w:r>
           </w:p>
@@ -589,7 +883,15 @@
             <w:hideMark/>
           </w:tcPr>
           <w:p>
+            <w:pPr>
+              <w:rPr>
+                <w:rFonts w:ascii="Times New Roman" w:hAnsi="Times New Roman" w:cs="Times New Roman"/>
+              </w:rPr>
+            </w:pPr>
             <w:r>
+              <w:rPr>
+                <w:rFonts w:ascii="Times New Roman" w:hAnsi="Times New Roman" w:cs="Times New Roman"/>
+              </w:rPr>
               <w:t>Branch</w:t>
             </w:r>
           </w:p>
@@ -601,7 +903,15 @@
             <w:hideMark/>
           </w:tcPr>
           <w:p>
+            <w:pPr>
+              <w:rPr>
+                <w:rFonts w:ascii="Times New Roman" w:hAnsi="Times New Roman" w:cs="Times New Roman"/>
+              </w:rPr>
+            </w:pPr>
             <w:r>
+              <w:rPr>
+                <w:rFonts w:ascii="Times New Roman" w:hAnsi="Times New Roman" w:cs="Times New Roman"/>
+              </w:rPr>
               <w:t>Choice</w:t>
             </w:r>
           </w:p>
@@ -618,7 +928,15 @@
             <w:hideMark/>
           </w:tcPr>
           <w:p>
+            <w:pPr>
+              <w:rPr>
+                <w:rFonts w:ascii="Times New Roman" w:hAnsi="Times New Roman" w:cs="Times New Roman"/>
+              </w:rPr>
+            </w:pPr>
             <w:r>
+              <w:rPr>
+                <w:rFonts w:ascii="Times New Roman" w:hAnsi="Times New Roman" w:cs="Times New Roman"/>
+              </w:rPr>
               <w:t>Email</w:t>
             </w:r>
           </w:p>
@@ -630,7 +948,15 @@
             <w:hideMark/>
           </w:tcPr>
           <w:p>
+            <w:pPr>
+              <w:rPr>
+                <w:rFonts w:ascii="Times New Roman" w:hAnsi="Times New Roman" w:cs="Times New Roman"/>
+              </w:rPr>
+            </w:pPr>
             <w:r>
+              <w:rPr>
+                <w:rFonts w:ascii="Times New Roman" w:hAnsi="Times New Roman" w:cs="Times New Roman"/>
+              </w:rPr>
               <w:t>String</w:t>
             </w:r>
           </w:p>
@@ -647,7 +973,15 @@
             <w:hideMark/>
           </w:tcPr>
           <w:p>
+            <w:pPr>
+              <w:rPr>
+                <w:rFonts w:ascii="Times New Roman" w:hAnsi="Times New Roman" w:cs="Times New Roman"/>
+              </w:rPr>
+            </w:pPr>
             <w:r>
+              <w:rPr>
+                <w:rFonts w:ascii="Times New Roman" w:hAnsi="Times New Roman" w:cs="Times New Roman"/>
+              </w:rPr>
               <w:t>Phone Number</w:t>
             </w:r>
           </w:p>
@@ -659,7 +993,15 @@
             <w:hideMark/>
           </w:tcPr>
           <w:p>
+            <w:pPr>
+              <w:rPr>
+                <w:rFonts w:ascii="Times New Roman" w:hAnsi="Times New Roman" w:cs="Times New Roman"/>
+              </w:rPr>
+            </w:pPr>
             <w:r>
+              <w:rPr>
+                <w:rFonts w:ascii="Times New Roman" w:hAnsi="Times New Roman" w:cs="Times New Roman"/>
+              </w:rPr>
               <w:t>String</w:t>
             </w:r>
           </w:p>
@@ -676,7 +1018,15 @@
             <w:hideMark/>
           </w:tcPr>
           <w:p>
+            <w:pPr>
+              <w:rPr>
+                <w:rFonts w:ascii="Times New Roman" w:hAnsi="Times New Roman" w:cs="Times New Roman"/>
+              </w:rPr>
+            </w:pPr>
             <w:r>
+              <w:rPr>
+                <w:rFonts w:ascii="Times New Roman" w:hAnsi="Times New Roman" w:cs="Times New Roman"/>
+              </w:rPr>
               <w:t>Description</w:t>
             </w:r>
           </w:p>
@@ -688,7 +1038,15 @@
             <w:hideMark/>
           </w:tcPr>
           <w:p>
+            <w:pPr>
+              <w:rPr>
+                <w:rFonts w:ascii="Times New Roman" w:hAnsi="Times New Roman" w:cs="Times New Roman"/>
+              </w:rPr>
+            </w:pPr>
             <w:r>
+              <w:rPr>
+                <w:rFonts w:ascii="Times New Roman" w:hAnsi="Times New Roman" w:cs="Times New Roman"/>
+              </w:rPr>
               <w:t>Multi String</w:t>
             </w:r>
           </w:p>
@@ -696,7 +1054,15 @@
       </w:tr>
     </w:tbl>
     <w:p>
-      <w:r>
+      <w:pPr>
+        <w:rPr>
+          <w:rFonts w:ascii="Times New Roman" w:hAnsi="Times New Roman" w:cs="Times New Roman"/>
+        </w:rPr>
+      </w:pPr>
+      <w:r>
+        <w:rPr>
+          <w:rFonts w:ascii="Times New Roman" w:hAnsi="Times New Roman" w:cs="Times New Roman"/>
+        </w:rPr>
         <w:t>The Branch field contains:</w:t>
       </w:r>
     </w:p>
@@ -706,8 +1072,14 @@
           <w:ilvl w:val="0"/>
           <w:numId w:val="3"/>
         </w:numPr>
-      </w:pPr>
-      <w:r>
+        <w:rPr>
+          <w:rFonts w:ascii="Times New Roman" w:hAnsi="Times New Roman" w:cs="Times New Roman"/>
+        </w:rPr>
+      </w:pPr>
+      <w:r>
+        <w:rPr>
+          <w:rFonts w:ascii="Times New Roman" w:hAnsi="Times New Roman" w:cs="Times New Roman"/>
+        </w:rPr>
         <w:t>ECE</w:t>
       </w:r>
     </w:p>
@@ -717,8 +1089,14 @@
           <w:ilvl w:val="0"/>
           <w:numId w:val="3"/>
         </w:numPr>
-      </w:pPr>
-      <w:r>
+        <w:rPr>
+          <w:rFonts w:ascii="Times New Roman" w:hAnsi="Times New Roman" w:cs="Times New Roman"/>
+        </w:rPr>
+      </w:pPr>
+      <w:r>
+        <w:rPr>
+          <w:rFonts w:ascii="Times New Roman" w:hAnsi="Times New Roman" w:cs="Times New Roman"/>
+        </w:rPr>
         <w:t>EEE</w:t>
       </w:r>
     </w:p>
@@ -728,22 +1106,34 @@
           <w:ilvl w:val="0"/>
           <w:numId w:val="3"/>
         </w:numPr>
-      </w:pPr>
-      <w:r>
+        <w:rPr>
+          <w:rFonts w:ascii="Times New Roman" w:hAnsi="Times New Roman" w:cs="Times New Roman"/>
+        </w:rPr>
+      </w:pPr>
+      <w:r>
+        <w:rPr>
+          <w:rFonts w:ascii="Times New Roman" w:hAnsi="Times New Roman" w:cs="Times New Roman"/>
+        </w:rPr>
         <w:t>CSE</w:t>
       </w:r>
     </w:p>
     <w:p>
       <w:pPr>
         <w:rPr>
+          <w:rFonts w:ascii="Times New Roman" w:hAnsi="Times New Roman" w:cs="Times New Roman"/>
           <w:b/>
           <w:bCs/>
-        </w:rPr>
-      </w:pPr>
-      <w:r>
-        <w:rPr>
+          <w:sz w:val="28"/>
+          <w:szCs w:val="28"/>
+        </w:rPr>
+      </w:pPr>
+      <w:r>
+        <w:rPr>
+          <w:rFonts w:ascii="Times New Roman" w:hAnsi="Times New Roman" w:cs="Times New Roman"/>
           <w:b/>
           <w:bCs/>
+          <w:sz w:val="28"/>
+          <w:szCs w:val="28"/>
         </w:rPr>
         <w:t>6. ACL Requirements</w:t>
       </w:r>
@@ -751,12 +1141,14 @@
     <w:p>
       <w:pPr>
         <w:rPr>
+          <w:rFonts w:ascii="Times New Roman" w:hAnsi="Times New Roman" w:cs="Times New Roman"/>
           <w:b/>
           <w:bCs/>
         </w:rPr>
       </w:pPr>
       <w:r>
         <w:rPr>
+          <w:rFonts w:ascii="Times New Roman" w:hAnsi="Times New Roman" w:cs="Times New Roman"/>
           <w:b/>
           <w:bCs/>
         </w:rPr>
@@ -769,8 +1161,14 @@
           <w:ilvl w:val="0"/>
           <w:numId w:val="4"/>
         </w:numPr>
-      </w:pPr>
-      <w:r>
+        <w:rPr>
+          <w:rFonts w:ascii="Times New Roman" w:hAnsi="Times New Roman" w:cs="Times New Roman"/>
+        </w:rPr>
+      </w:pPr>
+      <w:r>
+        <w:rPr>
+          <w:rFonts w:ascii="Times New Roman" w:hAnsi="Times New Roman" w:cs="Times New Roman"/>
+        </w:rPr>
         <w:t>Role: bb1</w:t>
       </w:r>
     </w:p>
@@ -780,20 +1178,28 @@
           <w:ilvl w:val="0"/>
           <w:numId w:val="4"/>
         </w:numPr>
-      </w:pPr>
-      <w:r>
+        <w:rPr>
+          <w:rFonts w:ascii="Times New Roman" w:hAnsi="Times New Roman" w:cs="Times New Roman"/>
+        </w:rPr>
+      </w:pPr>
+      <w:r>
+        <w:rPr>
+          <w:rFonts w:ascii="Times New Roman" w:hAnsi="Times New Roman" w:cs="Times New Roman"/>
+        </w:rPr>
         <w:t>Data condition: Branch is EEE</w:t>
       </w:r>
     </w:p>
     <w:p>
       <w:pPr>
         <w:rPr>
+          <w:rFonts w:ascii="Times New Roman" w:hAnsi="Times New Roman" w:cs="Times New Roman"/>
           <w:b/>
           <w:bCs/>
         </w:rPr>
       </w:pPr>
       <w:r>
         <w:rPr>
+          <w:rFonts w:ascii="Times New Roman" w:hAnsi="Times New Roman" w:cs="Times New Roman"/>
           <w:b/>
           <w:bCs/>
         </w:rPr>
@@ -806,20 +1212,28 @@
           <w:ilvl w:val="0"/>
           <w:numId w:val="5"/>
         </w:numPr>
-      </w:pPr>
-      <w:r>
+        <w:rPr>
+          <w:rFonts w:ascii="Times New Roman" w:hAnsi="Times New Roman" w:cs="Times New Roman"/>
+        </w:rPr>
+      </w:pPr>
+      <w:r>
+        <w:rPr>
+          <w:rFonts w:ascii="Times New Roman" w:hAnsi="Times New Roman" w:cs="Times New Roman"/>
+        </w:rPr>
         <w:t>Role: bb2</w:t>
       </w:r>
     </w:p>
     <w:p>
       <w:pPr>
         <w:rPr>
+          <w:rFonts w:ascii="Times New Roman" w:hAnsi="Times New Roman" w:cs="Times New Roman"/>
           <w:b/>
           <w:bCs/>
         </w:rPr>
       </w:pPr>
       <w:r>
         <w:rPr>
+          <w:rFonts w:ascii="Times New Roman" w:hAnsi="Times New Roman" w:cs="Times New Roman"/>
           <w:b/>
           <w:bCs/>
         </w:rPr>
@@ -832,25 +1246,36 @@
           <w:ilvl w:val="0"/>
           <w:numId w:val="6"/>
         </w:numPr>
-      </w:pPr>
-      <w:r>
+        <w:rPr>
+          <w:rFonts w:ascii="Times New Roman" w:hAnsi="Times New Roman" w:cs="Times New Roman"/>
+        </w:rPr>
+      </w:pPr>
+      <w:r>
+        <w:rPr>
+          <w:rFonts w:ascii="Times New Roman" w:hAnsi="Times New Roman" w:cs="Times New Roman"/>
+        </w:rPr>
         <w:t>Role: bb3</w:t>
       </w:r>
     </w:p>
     <w:p>
       <w:pPr>
         <w:ind w:left="720"/>
-      </w:pPr>
-    </w:p>
-    <w:p>
-      <w:pPr>
-        <w:rPr>
+        <w:rPr>
+          <w:rFonts w:ascii="Times New Roman" w:hAnsi="Times New Roman" w:cs="Times New Roman"/>
+        </w:rPr>
+      </w:pPr>
+    </w:p>
+    <w:p>
+      <w:pPr>
+        <w:rPr>
+          <w:rFonts w:ascii="Times New Roman" w:hAnsi="Times New Roman" w:cs="Times New Roman"/>
           <w:b/>
           <w:bCs/>
         </w:rPr>
       </w:pPr>
       <w:r>
         <w:rPr>
+          <w:rFonts w:ascii="Times New Roman" w:hAnsi="Times New Roman" w:cs="Times New Roman"/>
           <w:b/>
           <w:bCs/>
         </w:rPr>
@@ -864,17 +1289,37 @@
           <w:ilvl w:val="0"/>
           <w:numId w:val="7"/>
         </w:numPr>
-      </w:pPr>
-      <w:r>
+        <w:rPr>
+          <w:rFonts w:ascii="Times New Roman" w:hAnsi="Times New Roman" w:cs="Times New Roman"/>
+        </w:rPr>
+      </w:pPr>
+      <w:r>
+        <w:rPr>
+          <w:rFonts w:ascii="Times New Roman" w:hAnsi="Times New Roman" w:cs="Times New Roman"/>
+        </w:rPr>
         <w:t>Role: bb4</w:t>
       </w:r>
     </w:p>
     <w:p>
-      <w:r>
+      <w:pPr>
+        <w:rPr>
+          <w:rFonts w:ascii="Times New Roman" w:hAnsi="Times New Roman" w:cs="Times New Roman"/>
+        </w:rPr>
+      </w:pPr>
+      <w:r>
+        <w:rPr>
+          <w:rFonts w:ascii="Times New Roman" w:hAnsi="Times New Roman" w:cs="Times New Roman"/>
+        </w:rPr>
         <w:t>Administrators retain full access.</w:t>
       </w:r>
     </w:p>
-    <w:p/>
+    <w:p>
+      <w:pPr>
+        <w:rPr>
+          <w:rFonts w:ascii="Times New Roman" w:hAnsi="Times New Roman" w:cs="Times New Roman"/>
+        </w:rPr>
+      </w:pPr>
+    </w:p>
     <w:sectPr>
       <w:pgSz w:w="11906" w:h="16838"/>
       <w:pgMar w:top="1440" w:right="1440" w:bottom="1440" w:left="1440" w:header="708" w:footer="708" w:gutter="0"/>
@@ -2525,6 +2970,7 @@
   <w:style w:type="character" w:default="1" w:styleId="DefaultParagraphFont">
     <w:name w:val="Default Paragraph Font"/>
     <w:uiPriority w:val="1"/>
+    <w:semiHidden/>
     <w:unhideWhenUsed/>
   </w:style>
   <w:style w:type="table" w:default="1" w:styleId="TableNormal">

</xml_diff>